<commit_message>
Solar SEO: section 4.2 statuses after Tilda fixes
Co-Authored-By: Claude Fable 5.1 <noreply@anthropic.com>
</commit_message>
<xml_diff>
--- a/docs/solar-seo/Solar-SEO-Strategy-Month-5.docx
+++ b/docs/solar-seo/Solar-SEO-Strategy-Month-5.docx
@@ -1290,7 +1290,7 @@
                 <w:b w:val="0"/>
                 <w:sz w:val="17"/>
               </w:rPr>
-              <w:t>Не сделано</w:t>
+              <w:t>Сделано 7 сентября</w:t>
             </w:r>
           </w:p>
         </w:tc>
@@ -1362,7 +1362,7 @@
                 <w:b w:val="0"/>
                 <w:sz w:val="17"/>
               </w:rPr>
-              <w:t>Не сделано</w:t>
+              <w:t>Сделано 7 сентября</w:t>
             </w:r>
           </w:p>
         </w:tc>
@@ -1434,7 +1434,7 @@
                 <w:b w:val="0"/>
                 <w:sz w:val="17"/>
               </w:rPr>
-              <w:t>Не сделано</w:t>
+              <w:t>Сделано 7 сентября</w:t>
             </w:r>
           </w:p>
         </w:tc>
@@ -1506,7 +1506,7 @@
                 <w:b w:val="0"/>
                 <w:sz w:val="17"/>
               </w:rPr>
-              <w:t>Частично</w:t>
+              <w:t>Частично, требует решения клиента</w:t>
             </w:r>
           </w:p>
         </w:tc>
@@ -1771,6 +1771,59 @@
       </w:tr>
     </w:tbl>
     <w:p/>
+    <w:p>
+      <w:r>
+        <w:t>Выполнено 7 сентября 2026 в Tilda и проверено по живому сайту:</w:t>
+      </w:r>
+    </w:p>
+    <w:p>
+      <w:pPr>
+        <w:pStyle w:val="ListBullet"/>
+      </w:pPr>
+      <w:r>
+        <w:t>У потоков "Блог RU" и "Блог EN" отключена генерация отдельных sitemap. Фид-карта sitemap-feeds.xml пуста, 7 адресов 404 и 17 дублей из неё исчезли. Статьи остаются в основном sitemap.xml, все адреса отдают 200.</w:t>
+      </w:r>
+    </w:p>
+    <w:p>
+      <w:pPr>
+        <w:pStyle w:val="ListBullet"/>
+      </w:pPr>
+      <w:r>
+        <w:t>/park и /ru/park закрыты от индексации галочкой "Запретить индексировать": вышли из sitemap, добавлены в robots.txt.</w:t>
+      </w:r>
+    </w:p>
+    <w:p>
+      <w:pPr>
+        <w:pStyle w:val="ListBullet"/>
+      </w:pPr>
+      <w:r>
+        <w:t>/ru/policy, /ru/oferta и /ru/licenses открыты для индексации, появились в sitemap.xml.</w:t>
+      </w:r>
+    </w:p>
+    <w:p>
+      <w:pPr>
+        <w:pStyle w:val="ListBullet"/>
+      </w:pPr>
+      <w:r>
+        <w:t>На хабах /aesthetic-services и /ru/aesthetic-services убраны дублирующие карточки Tesla Former и Icoone, по одной ссылке на каждую услугу.</w:t>
+      </w:r>
+    </w:p>
+    <w:p>
+      <w:pPr>
+        <w:pStyle w:val="ListBullet"/>
+      </w:pPr>
+      <w:r>
+        <w:t>Микроразметка товаров: в настройках магазина Tilda переключателя нет, только флаг Sitemap магазина. Варианты для клиента: заполнить описания 207 карточек либо закрыть карточки магазина от индексации, так как магазин не цель продвижения.</w:t>
+      </w:r>
+    </w:p>
+    <w:p>
+      <w:pPr>
+        <w:pStyle w:val="ListBullet"/>
+      </w:pPr>
+      <w:r>
+        <w:t>Два H1 на главной: это один Zero-блок 1990085241, продублированный слайдером, а не две разные записи. Правится заменой тега во втором экземпляре или отключением слайдера, вопрос к дизайнеру.</w:t>
+      </w:r>
+    </w:p>
     <w:p>
       <w:r>
         <w:t>Дополнительно найдено при сверке:</w:t>

</xml_diff>